<commit_message>
added commands to delete models and list them.
</commit_message>
<xml_diff>
--- a/Method for evaluating performance of several.docx
+++ b/Method for evaluating performance of several.docx
@@ -189,6 +189,163 @@
           <w:rFonts w:ascii="Times New Roman" w:hAnsi="Times New Roman" w:cs="Times New Roman"/>
         </w:rPr>
         <w:t>Quantization methods: FP16 (baseline), GGUF(Q8, Q6, Q5, Q4), AWQ, GPTQ</w:t>
+      </w:r>
+    </w:p>
+    <w:p>
+      <w:pPr>
+        <w:rPr>
+          <w:rFonts w:ascii="Times New Roman" w:hAnsi="Times New Roman" w:cs="Times New Roman"/>
+        </w:rPr>
+      </w:pPr>
+      <w:r>
+        <w:rPr>
+          <w:rFonts w:ascii="Times New Roman" w:hAnsi="Times New Roman" w:cs="Times New Roman"/>
+        </w:rPr>
+        <w:t xml:space="preserve">New ones jk: </w:t>
+      </w:r>
+    </w:p>
+    <w:p>
+      <w:pPr>
+        <w:pStyle w:val="ListParagraph"/>
+        <w:numPr>
+          <w:ilvl w:val="0"/>
+          <w:numId w:val="1"/>
+        </w:numPr>
+        <w:rPr>
+          <w:rFonts w:ascii="Times New Roman" w:hAnsi="Times New Roman" w:cs="Times New Roman"/>
+        </w:rPr>
+      </w:pPr>
+      <w:r>
+        <w:rPr>
+          <w:rFonts w:ascii="Times New Roman" w:hAnsi="Times New Roman" w:cs="Times New Roman"/>
+        </w:rPr>
+        <w:t>Symmetric uniform int8 weight only quantization (simple)</w:t>
+      </w:r>
+    </w:p>
+    <w:p>
+      <w:pPr>
+        <w:pStyle w:val="ListParagraph"/>
+        <w:numPr>
+          <w:ilvl w:val="1"/>
+          <w:numId w:val="1"/>
+        </w:numPr>
+        <w:rPr>
+          <w:rFonts w:ascii="Times New Roman" w:hAnsi="Times New Roman" w:cs="Times New Roman"/>
+        </w:rPr>
+      </w:pPr>
+      <w:r>
+        <w:rPr>
+          <w:rFonts w:ascii="Times New Roman" w:hAnsi="Times New Roman" w:cs="Times New Roman"/>
+        </w:rPr>
+        <w:t>Per tensor</w:t>
+      </w:r>
+    </w:p>
+    <w:p>
+      <w:pPr>
+        <w:pStyle w:val="ListParagraph"/>
+        <w:numPr>
+          <w:ilvl w:val="1"/>
+          <w:numId w:val="1"/>
+        </w:numPr>
+        <w:rPr>
+          <w:rFonts w:ascii="Times New Roman" w:hAnsi="Times New Roman" w:cs="Times New Roman"/>
+        </w:rPr>
+      </w:pPr>
+      <w:r>
+        <w:rPr>
+          <w:rFonts w:ascii="Times New Roman" w:hAnsi="Times New Roman" w:cs="Times New Roman"/>
+        </w:rPr>
+        <w:t>Per channel</w:t>
+      </w:r>
+    </w:p>
+    <w:p>
+      <w:pPr>
+        <w:pStyle w:val="ListParagraph"/>
+        <w:numPr>
+          <w:ilvl w:val="0"/>
+          <w:numId w:val="1"/>
+        </w:numPr>
+        <w:rPr>
+          <w:rFonts w:ascii="Times New Roman" w:hAnsi="Times New Roman" w:cs="Times New Roman"/>
+        </w:rPr>
+      </w:pPr>
+      <w:r>
+        <w:rPr>
+          <w:rFonts w:ascii="Times New Roman" w:hAnsi="Times New Roman" w:cs="Times New Roman"/>
+        </w:rPr>
+        <w:t>Symmetric uniform int4 grouped</w:t>
+      </w:r>
+    </w:p>
+    <w:p>
+      <w:pPr>
+        <w:pStyle w:val="ListParagraph"/>
+        <w:numPr>
+          <w:ilvl w:val="0"/>
+          <w:numId w:val="1"/>
+        </w:numPr>
+        <w:rPr>
+          <w:rFonts w:ascii="Times New Roman" w:hAnsi="Times New Roman" w:cs="Times New Roman"/>
+        </w:rPr>
+      </w:pPr>
+      <w:r>
+        <w:rPr>
+          <w:rFonts w:ascii="Times New Roman" w:hAnsi="Times New Roman" w:cs="Times New Roman"/>
+        </w:rPr>
+        <w:t>GPTQ (advanced baseline)</w:t>
+      </w:r>
+    </w:p>
+    <w:p>
+      <w:pPr>
+        <w:pStyle w:val="ListParagraph"/>
+        <w:numPr>
+          <w:ilvl w:val="0"/>
+          <w:numId w:val="1"/>
+        </w:numPr>
+        <w:rPr>
+          <w:rFonts w:ascii="Times New Roman" w:hAnsi="Times New Roman" w:cs="Times New Roman"/>
+        </w:rPr>
+      </w:pPr>
+      <w:r>
+        <w:rPr>
+          <w:rFonts w:ascii="Times New Roman" w:hAnsi="Times New Roman" w:cs="Times New Roman"/>
+        </w:rPr>
+        <w:t>Special cases (optional)</w:t>
+      </w:r>
+    </w:p>
+    <w:p>
+      <w:pPr>
+        <w:pStyle w:val="ListParagraph"/>
+        <w:numPr>
+          <w:ilvl w:val="1"/>
+          <w:numId w:val="1"/>
+        </w:numPr>
+        <w:rPr>
+          <w:rFonts w:ascii="Times New Roman" w:hAnsi="Times New Roman" w:cs="Times New Roman"/>
+        </w:rPr>
+      </w:pPr>
+      <w:r>
+        <w:rPr>
+          <w:rFonts w:ascii="Times New Roman" w:hAnsi="Times New Roman" w:cs="Times New Roman"/>
+        </w:rPr>
+        <w:t>Int8 dynamic activations + int8/int4 weights</w:t>
+      </w:r>
+    </w:p>
+    <w:p>
+      <w:pPr>
+        <w:pStyle w:val="ListParagraph"/>
+        <w:numPr>
+          <w:ilvl w:val="1"/>
+          <w:numId w:val="1"/>
+        </w:numPr>
+        <w:rPr>
+          <w:rFonts w:ascii="Times New Roman" w:hAnsi="Times New Roman" w:cs="Times New Roman"/>
+        </w:rPr>
+      </w:pPr>
+      <w:r>
+        <w:rPr>
+          <w:rFonts w:ascii="Times New Roman" w:hAnsi="Times New Roman" w:cs="Times New Roman"/>
+        </w:rPr>
+        <w:t>Static activation calibration with observers</w:t>
       </w:r>
     </w:p>
     <w:p>
@@ -1062,6 +1219,575 @@
     </w:p>
     <w:p>
       <w:pPr>
+        <w:rPr>
+          <w:rFonts w:ascii="Times New Roman" w:hAnsi="Times New Roman" w:cs="Times New Roman"/>
+        </w:rPr>
+      </w:pPr>
+    </w:p>
+    <w:p>
+      <w:pPr>
+        <w:rPr>
+          <w:rFonts w:ascii="Times New Roman" w:hAnsi="Times New Roman" w:cs="Times New Roman"/>
+        </w:rPr>
+      </w:pPr>
+      <w:r>
+        <w:rPr>
+          <w:rFonts w:ascii="Times New Roman" w:hAnsi="Times New Roman" w:cs="Times New Roman"/>
+        </w:rPr>
+        <w:t>To do:</w:t>
+      </w:r>
+      <w:r>
+        <w:rPr>
+          <w:rFonts w:ascii="Times New Roman" w:hAnsi="Times New Roman" w:cs="Times New Roman"/>
+        </w:rPr>
+        <w:br/>
+        <w:t xml:space="preserve">- </w:t>
+      </w:r>
+    </w:p>
+    <w:p>
+      <w:pPr>
+        <w:rPr>
+          <w:rFonts w:ascii="Times New Roman" w:hAnsi="Times New Roman" w:cs="Times New Roman"/>
+        </w:rPr>
+      </w:pPr>
+      <w:r>
+        <w:rPr>
+          <w:rFonts w:ascii="Times New Roman" w:hAnsi="Times New Roman" w:cs="Times New Roman"/>
+        </w:rPr>
+        <w:t>Pipeline:</w:t>
+      </w:r>
+      <w:r>
+        <w:rPr>
+          <w:rFonts w:ascii="Times New Roman" w:hAnsi="Times New Roman" w:cs="Times New Roman"/>
+        </w:rPr>
+        <w:br/>
+        <w:t>1) downloading models (full) from HF</w:t>
+      </w:r>
+    </w:p>
+    <w:p>
+      <w:pPr>
+        <w:rPr>
+          <w:rFonts w:ascii="Times New Roman" w:hAnsi="Times New Roman" w:cs="Times New Roman"/>
+        </w:rPr>
+      </w:pPr>
+      <w:r>
+        <w:rPr>
+          <w:rFonts w:ascii="Times New Roman" w:hAnsi="Times New Roman" w:cs="Times New Roman"/>
+        </w:rPr>
+        <w:t xml:space="preserve">2) </w:t>
+      </w:r>
+      <w:r>
+        <w:rPr>
+          <w:rFonts w:ascii="Times New Roman" w:hAnsi="Times New Roman" w:cs="Times New Roman"/>
+        </w:rPr>
+        <w:t>Prepare calibration (data) and run quantization algo, save checkpoint, reload +validate</w:t>
+      </w:r>
+    </w:p>
+    <w:p>
+      <w:pPr>
+        <w:rPr>
+          <w:rFonts w:ascii="Times New Roman" w:hAnsi="Times New Roman" w:cs="Times New Roman"/>
+        </w:rPr>
+      </w:pPr>
+    </w:p>
+    <w:p>
+      <w:pPr>
+        <w:rPr>
+          <w:rFonts w:ascii="Times New Roman" w:hAnsi="Times New Roman" w:cs="Times New Roman"/>
+        </w:rPr>
+      </w:pPr>
+    </w:p>
+    <w:p>
+      <w:pPr>
+        <w:rPr>
+          <w:rFonts w:ascii="Times New Roman" w:hAnsi="Times New Roman" w:cs="Times New Roman"/>
+        </w:rPr>
+      </w:pPr>
+      <w:r>
+        <w:rPr>
+          <w:rFonts w:ascii="Times New Roman" w:hAnsi="Times New Roman" w:cs="Times New Roman"/>
+        </w:rPr>
+        <w:t>Requirements:</w:t>
+      </w:r>
+    </w:p>
+    <w:p>
+      <w:pPr>
+        <w:pStyle w:val="ListParagraph"/>
+        <w:numPr>
+          <w:ilvl w:val="0"/>
+          <w:numId w:val="1"/>
+        </w:numPr>
+        <w:rPr>
+          <w:rFonts w:ascii="Times New Roman" w:hAnsi="Times New Roman" w:cs="Times New Roman"/>
+        </w:rPr>
+      </w:pPr>
+      <w:r>
+        <w:rPr>
+          <w:rFonts w:ascii="Times New Roman" w:hAnsi="Times New Roman" w:cs="Times New Roman"/>
+        </w:rPr>
+        <w:t>There are 2 parts of this program. 1) a</w:t>
+      </w:r>
+      <w:r>
+        <w:rPr>
+          <w:rFonts w:ascii="Times New Roman" w:hAnsi="Times New Roman" w:cs="Times New Roman"/>
+        </w:rPr>
+        <w:t xml:space="preserve"> multi-</w:t>
+      </w:r>
+      <w:r>
+        <w:rPr>
+          <w:rFonts w:ascii="Times New Roman" w:hAnsi="Times New Roman" w:cs="Times New Roman"/>
+        </w:rPr>
+        <w:t>model obtainer and quantizer and 2) a program to evaluate the quantized set of models. We are just working on part 1 now.</w:t>
+      </w:r>
+    </w:p>
+    <w:p>
+      <w:pPr>
+        <w:pStyle w:val="ListParagraph"/>
+        <w:numPr>
+          <w:ilvl w:val="0"/>
+          <w:numId w:val="1"/>
+        </w:numPr>
+        <w:rPr>
+          <w:rFonts w:ascii="Times New Roman" w:hAnsi="Times New Roman" w:cs="Times New Roman"/>
+        </w:rPr>
+      </w:pPr>
+      <w:r>
+        <w:rPr>
+          <w:rFonts w:ascii="Times New Roman" w:hAnsi="Times New Roman" w:cs="Times New Roman"/>
+        </w:rPr>
+        <w:t>The program should be in python</w:t>
+      </w:r>
+    </w:p>
+    <w:p>
+      <w:pPr>
+        <w:pStyle w:val="ListParagraph"/>
+        <w:numPr>
+          <w:ilvl w:val="0"/>
+          <w:numId w:val="1"/>
+        </w:numPr>
+        <w:rPr>
+          <w:rFonts w:ascii="Times New Roman" w:hAnsi="Times New Roman" w:cs="Times New Roman"/>
+        </w:rPr>
+      </w:pPr>
+      <w:r>
+        <w:rPr>
+          <w:rFonts w:ascii="Times New Roman" w:hAnsi="Times New Roman" w:cs="Times New Roman"/>
+        </w:rPr>
+        <w:t xml:space="preserve">The program should be split into 3 parts: </w:t>
+      </w:r>
+    </w:p>
+    <w:p>
+      <w:pPr>
+        <w:pStyle w:val="ListParagraph"/>
+        <w:numPr>
+          <w:ilvl w:val="1"/>
+          <w:numId w:val="1"/>
+        </w:numPr>
+        <w:rPr>
+          <w:rFonts w:ascii="Times New Roman" w:hAnsi="Times New Roman" w:cs="Times New Roman"/>
+        </w:rPr>
+      </w:pPr>
+      <w:r>
+        <w:rPr>
+          <w:rFonts w:ascii="Times New Roman" w:hAnsi="Times New Roman" w:cs="Times New Roman"/>
+        </w:rPr>
+        <w:t>downloading the models and saving them.</w:t>
+      </w:r>
+    </w:p>
+    <w:p>
+      <w:pPr>
+        <w:pStyle w:val="ListParagraph"/>
+        <w:numPr>
+          <w:ilvl w:val="1"/>
+          <w:numId w:val="1"/>
+        </w:numPr>
+        <w:rPr>
+          <w:rFonts w:ascii="Times New Roman" w:hAnsi="Times New Roman" w:cs="Times New Roman"/>
+        </w:rPr>
+      </w:pPr>
+      <w:r>
+        <w:rPr>
+          <w:rFonts w:ascii="Times New Roman" w:hAnsi="Times New Roman" w:cs="Times New Roman"/>
+        </w:rPr>
+        <w:t>For each model, quantizing it by several different methods then moving onto next model</w:t>
+      </w:r>
+    </w:p>
+    <w:p>
+      <w:pPr>
+        <w:pStyle w:val="ListParagraph"/>
+        <w:numPr>
+          <w:ilvl w:val="0"/>
+          <w:numId w:val="1"/>
+        </w:numPr>
+        <w:rPr>
+          <w:rFonts w:ascii="Times New Roman" w:hAnsi="Times New Roman" w:cs="Times New Roman"/>
+        </w:rPr>
+      </w:pPr>
+      <w:r>
+        <w:rPr>
+          <w:rFonts w:ascii="Times New Roman" w:hAnsi="Times New Roman" w:cs="Times New Roman"/>
+        </w:rPr>
+        <w:t>Models are the following</w:t>
+      </w:r>
+    </w:p>
+    <w:p>
+      <w:pPr>
+        <w:pStyle w:val="ListParagraph"/>
+        <w:numPr>
+          <w:ilvl w:val="1"/>
+          <w:numId w:val="1"/>
+        </w:numPr>
+        <w:rPr>
+          <w:rFonts w:ascii="Times New Roman" w:hAnsi="Times New Roman" w:cs="Times New Roman"/>
+        </w:rPr>
+      </w:pPr>
+      <w:r>
+        <w:rPr>
+          <w:rFonts w:ascii="Times New Roman" w:hAnsi="Times New Roman" w:cs="Times New Roman"/>
+        </w:rPr>
+        <w:t>Google gemma 27bit</w:t>
+      </w:r>
+    </w:p>
+    <w:p>
+      <w:pPr>
+        <w:pStyle w:val="ListParagraph"/>
+        <w:numPr>
+          <w:ilvl w:val="1"/>
+          <w:numId w:val="1"/>
+        </w:numPr>
+        <w:rPr>
+          <w:rFonts w:ascii="Times New Roman" w:hAnsi="Times New Roman" w:cs="Times New Roman"/>
+        </w:rPr>
+      </w:pPr>
+      <w:r>
+        <w:rPr>
+          <w:rFonts w:ascii="Times New Roman" w:hAnsi="Times New Roman" w:cs="Times New Roman"/>
+        </w:rPr>
+        <w:t>Google gemma 9bit</w:t>
+      </w:r>
+    </w:p>
+    <w:p>
+      <w:pPr>
+        <w:pStyle w:val="ListParagraph"/>
+        <w:numPr>
+          <w:ilvl w:val="1"/>
+          <w:numId w:val="1"/>
+        </w:numPr>
+        <w:rPr>
+          <w:rFonts w:ascii="Times New Roman" w:hAnsi="Times New Roman" w:cs="Times New Roman"/>
+        </w:rPr>
+      </w:pPr>
+      <w:r>
+        <w:rPr>
+          <w:rFonts w:ascii="Times New Roman" w:hAnsi="Times New Roman" w:cs="Times New Roman"/>
+        </w:rPr>
+        <w:t>Llama 3-8b</w:t>
+      </w:r>
+    </w:p>
+    <w:p>
+      <w:pPr>
+        <w:pStyle w:val="ListParagraph"/>
+        <w:numPr>
+          <w:ilvl w:val="1"/>
+          <w:numId w:val="1"/>
+        </w:numPr>
+        <w:rPr>
+          <w:rFonts w:ascii="Times New Roman" w:hAnsi="Times New Roman" w:cs="Times New Roman"/>
+        </w:rPr>
+      </w:pPr>
+      <w:r>
+        <w:rPr>
+          <w:rFonts w:ascii="Times New Roman" w:hAnsi="Times New Roman" w:cs="Times New Roman"/>
+        </w:rPr>
+        <w:t>Mistral 7b</w:t>
+      </w:r>
+    </w:p>
+    <w:p>
+      <w:pPr>
+        <w:pStyle w:val="ListParagraph"/>
+        <w:numPr>
+          <w:ilvl w:val="1"/>
+          <w:numId w:val="1"/>
+        </w:numPr>
+        <w:rPr>
+          <w:rFonts w:ascii="Times New Roman" w:hAnsi="Times New Roman" w:cs="Times New Roman"/>
+        </w:rPr>
+      </w:pPr>
+      <w:r>
+        <w:rPr>
+          <w:rFonts w:ascii="Times New Roman" w:hAnsi="Times New Roman" w:cs="Times New Roman"/>
+        </w:rPr>
+        <w:t>Phi3</w:t>
+      </w:r>
+    </w:p>
+    <w:p>
+      <w:pPr>
+        <w:pStyle w:val="ListParagraph"/>
+        <w:numPr>
+          <w:ilvl w:val="1"/>
+          <w:numId w:val="1"/>
+        </w:numPr>
+        <w:rPr>
+          <w:rFonts w:ascii="Times New Roman" w:hAnsi="Times New Roman" w:cs="Times New Roman"/>
+        </w:rPr>
+      </w:pPr>
+      <w:r>
+        <w:rPr>
+          <w:rFonts w:ascii="Times New Roman" w:hAnsi="Times New Roman" w:cs="Times New Roman"/>
+        </w:rPr>
+        <w:t>Mixtral 8x7b (maybe)</w:t>
+      </w:r>
+    </w:p>
+    <w:p>
+      <w:pPr>
+        <w:pStyle w:val="ListParagraph"/>
+        <w:numPr>
+          <w:ilvl w:val="0"/>
+          <w:numId w:val="1"/>
+        </w:numPr>
+        <w:rPr>
+          <w:rFonts w:ascii="Times New Roman" w:hAnsi="Times New Roman" w:cs="Times New Roman"/>
+        </w:rPr>
+      </w:pPr>
+      <w:r>
+        <w:rPr>
+          <w:rFonts w:ascii="Times New Roman" w:hAnsi="Times New Roman" w:cs="Times New Roman"/>
+        </w:rPr>
+        <w:t>Quantization methods are the following:</w:t>
+      </w:r>
+    </w:p>
+    <w:p>
+      <w:pPr>
+        <w:pStyle w:val="ListParagraph"/>
+        <w:numPr>
+          <w:ilvl w:val="1"/>
+          <w:numId w:val="1"/>
+        </w:numPr>
+        <w:rPr>
+          <w:rFonts w:ascii="Times New Roman" w:hAnsi="Times New Roman" w:cs="Times New Roman"/>
+        </w:rPr>
+      </w:pPr>
+      <w:r>
+        <w:rPr>
+          <w:rFonts w:ascii="Times New Roman" w:hAnsi="Times New Roman" w:cs="Times New Roman"/>
+        </w:rPr>
+        <w:t>Symmetric uniform int8 weight only quantization (simple)</w:t>
+      </w:r>
+    </w:p>
+    <w:p>
+      <w:pPr>
+        <w:pStyle w:val="ListParagraph"/>
+        <w:numPr>
+          <w:ilvl w:val="2"/>
+          <w:numId w:val="1"/>
+        </w:numPr>
+        <w:rPr>
+          <w:rFonts w:ascii="Times New Roman" w:hAnsi="Times New Roman" w:cs="Times New Roman"/>
+        </w:rPr>
+      </w:pPr>
+      <w:r>
+        <w:rPr>
+          <w:rFonts w:ascii="Times New Roman" w:hAnsi="Times New Roman" w:cs="Times New Roman"/>
+        </w:rPr>
+        <w:t>Per tensor</w:t>
+      </w:r>
+    </w:p>
+    <w:p>
+      <w:pPr>
+        <w:pStyle w:val="ListParagraph"/>
+        <w:numPr>
+          <w:ilvl w:val="2"/>
+          <w:numId w:val="1"/>
+        </w:numPr>
+        <w:rPr>
+          <w:rFonts w:ascii="Times New Roman" w:hAnsi="Times New Roman" w:cs="Times New Roman"/>
+        </w:rPr>
+      </w:pPr>
+      <w:r>
+        <w:rPr>
+          <w:rFonts w:ascii="Times New Roman" w:hAnsi="Times New Roman" w:cs="Times New Roman"/>
+        </w:rPr>
+        <w:t>Per channel</w:t>
+      </w:r>
+    </w:p>
+    <w:p>
+      <w:pPr>
+        <w:pStyle w:val="ListParagraph"/>
+        <w:numPr>
+          <w:ilvl w:val="1"/>
+          <w:numId w:val="1"/>
+        </w:numPr>
+        <w:rPr>
+          <w:rFonts w:ascii="Times New Roman" w:hAnsi="Times New Roman" w:cs="Times New Roman"/>
+        </w:rPr>
+      </w:pPr>
+      <w:r>
+        <w:rPr>
+          <w:rFonts w:ascii="Times New Roman" w:hAnsi="Times New Roman" w:cs="Times New Roman"/>
+        </w:rPr>
+        <w:t>Symmetric uniform int4 grouped</w:t>
+      </w:r>
+    </w:p>
+    <w:p>
+      <w:pPr>
+        <w:pStyle w:val="ListParagraph"/>
+        <w:numPr>
+          <w:ilvl w:val="1"/>
+          <w:numId w:val="1"/>
+        </w:numPr>
+        <w:rPr>
+          <w:rFonts w:ascii="Times New Roman" w:hAnsi="Times New Roman" w:cs="Times New Roman"/>
+        </w:rPr>
+      </w:pPr>
+      <w:r>
+        <w:rPr>
+          <w:rFonts w:ascii="Times New Roman" w:hAnsi="Times New Roman" w:cs="Times New Roman"/>
+        </w:rPr>
+        <w:t>GPTQ</w:t>
+      </w:r>
+    </w:p>
+    <w:p>
+      <w:pPr>
+        <w:pStyle w:val="ListParagraph"/>
+        <w:numPr>
+          <w:ilvl w:val="0"/>
+          <w:numId w:val="1"/>
+        </w:numPr>
+        <w:rPr>
+          <w:rFonts w:ascii="Times New Roman" w:hAnsi="Times New Roman" w:cs="Times New Roman"/>
+        </w:rPr>
+      </w:pPr>
+      <w:r>
+        <w:rPr>
+          <w:rFonts w:ascii="Times New Roman" w:hAnsi="Times New Roman" w:cs="Times New Roman"/>
+        </w:rPr>
+        <w:t>The user should be able to enter models and quantization methods to download in a config file, and then select which of these the program should run at runtime.</w:t>
+      </w:r>
+    </w:p>
+    <w:p>
+      <w:pPr>
+        <w:pStyle w:val="ListParagraph"/>
+        <w:numPr>
+          <w:ilvl w:val="0"/>
+          <w:numId w:val="1"/>
+        </w:numPr>
+        <w:rPr>
+          <w:rFonts w:ascii="Times New Roman" w:hAnsi="Times New Roman" w:cs="Times New Roman"/>
+        </w:rPr>
+      </w:pPr>
+      <w:r>
+        <w:rPr>
+          <w:rFonts w:ascii="Times New Roman" w:hAnsi="Times New Roman" w:cs="Times New Roman"/>
+        </w:rPr>
+        <w:t>Int8/int4 quantization code should be separate for better readability</w:t>
+      </w:r>
+    </w:p>
+    <w:p>
+      <w:pPr>
+        <w:pStyle w:val="ListParagraph"/>
+        <w:numPr>
+          <w:ilvl w:val="0"/>
+          <w:numId w:val="1"/>
+        </w:numPr>
+        <w:rPr>
+          <w:rFonts w:ascii="Times New Roman" w:hAnsi="Times New Roman" w:cs="Times New Roman"/>
+        </w:rPr>
+      </w:pPr>
+      <w:r>
+        <w:rPr>
+          <w:rFonts w:ascii="Times New Roman" w:hAnsi="Times New Roman" w:cs="Times New Roman"/>
+        </w:rPr>
+        <w:t>Code for int4/int8 should be documented extensively</w:t>
+      </w:r>
+    </w:p>
+    <w:p>
+      <w:pPr>
+        <w:pStyle w:val="ListParagraph"/>
+        <w:numPr>
+          <w:ilvl w:val="0"/>
+          <w:numId w:val="1"/>
+        </w:numPr>
+        <w:rPr>
+          <w:rFonts w:ascii="Times New Roman" w:hAnsi="Times New Roman" w:cs="Times New Roman"/>
+        </w:rPr>
+      </w:pPr>
+      <w:r>
+        <w:rPr>
+          <w:rFonts w:ascii="Times New Roman" w:hAnsi="Times New Roman" w:cs="Times New Roman"/>
+        </w:rPr>
+        <w:t xml:space="preserve">Save a logfile (in a logs directory) for each model/quantization pair </w:t>
+      </w:r>
+      <w:r>
+        <w:rPr>
+          <w:rFonts w:ascii="Times New Roman" w:hAnsi="Times New Roman" w:cs="Times New Roman"/>
+        </w:rPr>
+        <w:t>that gets created containing</w:t>
+      </w:r>
+      <w:r>
+        <w:rPr>
+          <w:rFonts w:ascii="Times New Roman" w:hAnsi="Times New Roman" w:cs="Times New Roman"/>
+        </w:rPr>
+        <w:t xml:space="preserve"> any relevant information</w:t>
+      </w:r>
+    </w:p>
+    <w:p>
+      <w:pPr>
+        <w:pStyle w:val="ListParagraph"/>
+        <w:numPr>
+          <w:ilvl w:val="0"/>
+          <w:numId w:val="1"/>
+        </w:numPr>
+        <w:rPr>
+          <w:rFonts w:ascii="Times New Roman" w:hAnsi="Times New Roman" w:cs="Times New Roman"/>
+        </w:rPr>
+      </w:pPr>
+      <w:r>
+        <w:rPr>
+          <w:rFonts w:ascii="Times New Roman" w:hAnsi="Times New Roman" w:cs="Times New Roman"/>
+        </w:rPr>
+        <w:t xml:space="preserve">The goal of this program is to demonstrate exactly how quantization works under the hood, while quantizing each model. </w:t>
+      </w:r>
+    </w:p>
+    <w:p>
+      <w:pPr>
+        <w:pStyle w:val="ListParagraph"/>
+        <w:numPr>
+          <w:ilvl w:val="0"/>
+          <w:numId w:val="1"/>
+        </w:numPr>
+        <w:rPr>
+          <w:rFonts w:ascii="Times New Roman" w:hAnsi="Times New Roman" w:cs="Times New Roman"/>
+        </w:rPr>
+      </w:pPr>
+      <w:r>
+        <w:rPr>
+          <w:rFonts w:ascii="Times New Roman" w:hAnsi="Times New Roman" w:cs="Times New Roman"/>
+        </w:rPr>
+        <w:lastRenderedPageBreak/>
+        <w:t>The quantized model should be usable (so we can examine how they compare later)</w:t>
+      </w:r>
+    </w:p>
+    <w:p>
+      <w:pPr>
+        <w:pStyle w:val="ListParagraph"/>
+        <w:numPr>
+          <w:ilvl w:val="0"/>
+          <w:numId w:val="1"/>
+        </w:numPr>
+        <w:rPr>
+          <w:rFonts w:ascii="Times New Roman" w:hAnsi="Times New Roman" w:cs="Times New Roman"/>
+        </w:rPr>
+      </w:pPr>
+      <w:r>
+        <w:rPr>
+          <w:rFonts w:ascii="Times New Roman" w:hAnsi="Times New Roman" w:cs="Times New Roman"/>
+        </w:rPr>
+        <w:t>This program should be able to run on a RTX5080 or the cloud</w:t>
+      </w:r>
+    </w:p>
+    <w:p>
+      <w:pPr>
+        <w:pStyle w:val="ListParagraph"/>
         <w:rPr>
           <w:rFonts w:ascii="Times New Roman" w:hAnsi="Times New Roman" w:cs="Times New Roman"/>
         </w:rPr>
@@ -1206,7 +1932,7 @@
         <w:rFonts w:ascii="Times New Roman" w:eastAsiaTheme="minorHAnsi" w:hAnsi="Times New Roman" w:cs="Times New Roman" w:hint="default"/>
       </w:rPr>
     </w:lvl>
-    <w:lvl w:ilvl="1" w:tplc="04090003" w:tentative="1">
+    <w:lvl w:ilvl="1" w:tplc="04090003">
       <w:start w:val="1"/>
       <w:numFmt w:val="bullet"/>
       <w:lvlText w:val="o"/>
@@ -1218,7 +1944,7 @@
         <w:rFonts w:ascii="Courier New" w:hAnsi="Courier New" w:cs="Courier New" w:hint="default"/>
       </w:rPr>
     </w:lvl>
-    <w:lvl w:ilvl="2" w:tplc="04090005" w:tentative="1">
+    <w:lvl w:ilvl="2" w:tplc="04090005">
       <w:start w:val="1"/>
       <w:numFmt w:val="bullet"/>
       <w:lvlText w:val=""/>

</xml_diff>